<commit_message>
Personalize assignment with student details (AMMAN JAKHAR / 2025eb01187)
</commit_message>
<xml_diff>
--- a/Graded_Assignment_Weeks1-6/finaloutput.docx
+++ b/Graded_Assignment_Weeks1-6/finaloutput.docx
@@ -24,7 +24,7 @@
           <w:b/>
           <w:sz w:val="24"/>
         </w:rPr>
-        <w:t xml:space="preserve">Student ID: STU2024001</w:t>
+        <w:t xml:space="preserve">Name: AMMAN JAKHAR</w:t>
       </w:r>
     </w:p>
     <w:p>
@@ -33,8 +33,31 @@
       </w:pPr>
       <w:r>
         <w:rPr>
+          <w:b/>
           <w:sz w:val="24"/>
         </w:rPr>
+        <w:t xml:space="preserve">Student ID (UID): 2025eb01187</w:t>
+      </w:r>
+    </w:p>
+    <w:p>
+      <w:pPr>
+        <w:spacing w:after="120"/>
+      </w:pPr>
+      <w:r>
+        <w:rPr>
+          <w:sz w:val="24"/>
+        </w:rPr>
+        <w:t xml:space="preserve">Email: 2025eb01187@online.bits-pilani.ac.in</w:t>
+      </w:r>
+    </w:p>
+    <w:p>
+      <w:pPr>
+        <w:spacing w:after="120"/>
+      </w:pPr>
+      <w:r>
+        <w:rPr>
+          <w:sz w:val="24"/>
+        </w:rPr>
         <w:t xml:space="preserve">Deliverables: IDCard.html, IDCard_styles.css, StudentApp.html, StudentApp.js</w:t>
       </w:r>
     </w:p>
@@ -46,7 +69,7 @@
         <w:rPr>
           <w:sz w:val="24"/>
         </w:rPr>
-        <w:t xml:space="preserve">The &lt;title&gt; of every HTML file is set to the Student ID and each source file contains a Student-ID comment, so it appears in the browser tab in the live screenshots.</w:t>
+        <w:t xml:space="preserve">The &lt;title&gt; of every HTML file is set to the Student ID (UID) and each source file contains a Student-ID comment, so it appears in the browser tab in the live screenshots.</w:t>
       </w:r>
     </w:p>
     <w:p>
@@ -124,7 +147,7 @@
           <w:color w:val="555555"/>
           <w:sz w:val="18"/>
         </w:rPr>
-        <w:t xml:space="preserve">Figure 1: IDCard.html rendered in the browser (name, DOB, photo placeholder, department, mobile, email, address; Student ID in the footer).</w:t>
+        <w:t xml:space="preserve">Figure 1: IDCard.html rendered in the browser (name, DOB, photo placeholder, department, mobile, email, address; UID in the footer).</w:t>
       </w:r>
     </w:p>
     <w:p>
@@ -234,7 +257,21 @@
           <w:rFonts w:ascii="Consolas" w:hAnsi="Consolas"/>
           <w:sz w:val="16"/>
         </w:rPr>
-        <w:t xml:space="preserve">  Student ID: STU2024001          &lt;-- replace with your real Student ID</w:t>
+        <w:t xml:space="preserve">  Name: AMMAN JAKHAR</w:t>
+      </w:r>
+    </w:p>
+    <w:p>
+      <w:pPr>
+        <w:spacing w:after="0" w:line="200" w:lineRule="auto"/>
+        <w:shd w:val="clear" w:fill="F4F6F9"/>
+      </w:pPr>
+      <w:r>
+        <w:rPr>
+          <w:color w:val="333333"/>
+          <w:rFonts w:ascii="Consolas" w:hAnsi="Consolas"/>
+          <w:sz w:val="16"/>
+        </w:rPr>
+        <w:t xml:space="preserve">  Student ID (UID): 2025eb01187</w:t>
       </w:r>
     </w:p>
     <w:p>
@@ -388,7 +425,7 @@
           <w:rFonts w:ascii="Consolas" w:hAnsi="Consolas"/>
           <w:sz w:val="16"/>
         </w:rPr>
-        <w:t xml:space="preserve">    &lt;title&gt;STU2024001&lt;/title&gt;</w:t>
+        <w:t xml:space="preserve">    &lt;title&gt;2025eb01187&lt;/title&gt;</w:t>
       </w:r>
     </w:p>
     <w:p>
@@ -584,7 +621,7 @@
           <w:rFonts w:ascii="Consolas" w:hAnsi="Consolas"/>
           <w:sz w:val="16"/>
         </w:rPr>
-        <w:t xml:space="preserve">            &lt;h1&gt;GREENWOOD UNIVERSITY&lt;/h1&gt;</w:t>
+        <w:t xml:space="preserve">            &lt;h1&gt;BITS PILANI&lt;/h1&gt;</w:t>
       </w:r>
     </w:p>
     <w:p>
@@ -864,7 +901,7 @@
           <w:rFonts w:ascii="Consolas" w:hAnsi="Consolas"/>
           <w:sz w:val="16"/>
         </w:rPr>
-        <w:t xml:space="preserve">                        &lt;span class="value"&gt;Ananya Sharma&lt;/span&gt;</w:t>
+        <w:t xml:space="preserve">                        &lt;span class="value"&gt;AMMAN JAKHAR&lt;/span&gt;</w:t>
       </w:r>
     </w:p>
     <w:p>
@@ -920,7 +957,7 @@
           <w:rFonts w:ascii="Consolas" w:hAnsi="Consolas"/>
           <w:sz w:val="16"/>
         </w:rPr>
-        <w:t xml:space="preserve">                        &lt;span class="value"&gt;15/08/2003&lt;/span&gt;</w:t>
+        <w:t xml:space="preserve">                        &lt;span class="value"&gt;29/08/1986&lt;/span&gt;</w:t>
       </w:r>
     </w:p>
     <w:p>
@@ -976,7 +1013,7 @@
           <w:rFonts w:ascii="Consolas" w:hAnsi="Consolas"/>
           <w:sz w:val="16"/>
         </w:rPr>
-        <w:t xml:space="preserve">                        &lt;span class="value"&gt;Computer Science &amp;amp; Engineering&lt;/span&gt;</w:t>
+        <w:t xml:space="preserve">                        &lt;span class="value"&gt;M.Tech (Online) - Computer Science&lt;/span&gt;</w:t>
       </w:r>
     </w:p>
     <w:p>
@@ -1088,7 +1125,7 @@
           <w:rFonts w:ascii="Consolas" w:hAnsi="Consolas"/>
           <w:sz w:val="16"/>
         </w:rPr>
-        <w:t xml:space="preserve">                        &lt;span class="value"&gt;ananya.sharma@greenwood.edu.in&lt;/span&gt;</w:t>
+        <w:t xml:space="preserve">                        &lt;span class="value"&gt;2025eb01187@online.bits-pilani.ac.in&lt;/span&gt;</w:t>
       </w:r>
     </w:p>
     <w:p>
@@ -1144,7 +1181,7 @@
           <w:rFonts w:ascii="Consolas" w:hAnsi="Consolas"/>
           <w:sz w:val="16"/>
         </w:rPr>
-        <w:t xml:space="preserve">                        &lt;span class="value"&gt;42, Lake View Road, Bengaluru, Karnataka - 560001&lt;/span&gt;</w:t>
+        <w:t xml:space="preserve">                        &lt;span class="value"&gt;BITS Pilani, Vidya Vihar, Pilani, Rajasthan - 333031&lt;/span&gt;</w:t>
       </w:r>
     </w:p>
     <w:p>
@@ -1256,7 +1293,7 @@
           <w:rFonts w:ascii="Consolas" w:hAnsi="Consolas"/>
           <w:sz w:val="16"/>
         </w:rPr>
-        <w:t xml:space="preserve">            &lt;span class="footer-id"&gt;ID: STU2024001&lt;/span&gt;</w:t>
+        <w:t xml:space="preserve">            &lt;span class="footer-id"&gt;UID: 2025eb01187&lt;/span&gt;</w:t>
       </w:r>
     </w:p>
     <w:p>
@@ -1434,7 +1471,7 @@
           <w:rFonts w:ascii="Consolas" w:hAnsi="Consolas"/>
           <w:sz w:val="16"/>
         </w:rPr>
-        <w:t xml:space="preserve">   Student ID: STU2024001</w:t>
+        <w:t xml:space="preserve">   Name: AMMAN JAKHAR | Student ID (UID): 2025eb01187</w:t>
       </w:r>
     </w:p>
     <w:p>
@@ -4207,7 +4244,21 @@
           <w:rFonts w:ascii="Consolas" w:hAnsi="Consolas"/>
           <w:sz w:val="16"/>
         </w:rPr>
-        <w:t xml:space="preserve">  Student ID: STU2024001          &lt;-- replace with your real Student ID</w:t>
+        <w:t xml:space="preserve">  Name: AMMAN JAKHAR</w:t>
+      </w:r>
+    </w:p>
+    <w:p>
+      <w:pPr>
+        <w:spacing w:after="0" w:line="200" w:lineRule="auto"/>
+        <w:shd w:val="clear" w:fill="F4F6F9"/>
+      </w:pPr>
+      <w:r>
+        <w:rPr>
+          <w:color w:val="333333"/>
+          <w:rFonts w:ascii="Consolas" w:hAnsi="Consolas"/>
+          <w:sz w:val="16"/>
+        </w:rPr>
+        <w:t xml:space="preserve">  Student ID (UID): 2025eb01187</w:t>
       </w:r>
     </w:p>
     <w:p>
@@ -4347,7 +4398,7 @@
           <w:rFonts w:ascii="Consolas" w:hAnsi="Consolas"/>
           <w:sz w:val="16"/>
         </w:rPr>
-        <w:t xml:space="preserve">    &lt;title&gt;STU2024001&lt;/title&gt;</w:t>
+        <w:t xml:space="preserve">    &lt;title&gt;2025eb01187&lt;/title&gt;</w:t>
       </w:r>
     </w:p>
     <w:p>
@@ -6429,7 +6480,7 @@
           <w:rFonts w:ascii="Consolas" w:hAnsi="Consolas"/>
           <w:sz w:val="16"/>
         </w:rPr>
-        <w:t xml:space="preserve">   Student ID: STU2024001</w:t>
+        <w:t xml:space="preserve">   Name: AMMAN JAKHAR | Student ID (UID): 2025eb01187</w:t>
       </w:r>
     </w:p>
     <w:p>

</xml_diff>